<commit_message>
Final presentation pass: translate machine guide and command sheets, tone fixes, wiki MD pages updated to the final campaign
</commit_message>
<xml_diff>
--- a/docs/Comandos_S2_S9.docx
+++ b/docs/Comandos_S2_S9.docx
@@ -15,7 +15,7 @@
           <w:sz w:val="40"/>
           <w:szCs w:val="40"/>
         </w:rPr>
-        <w:t xml:space="preserve">BruSafe MD — Comandos para S2 y S9</w:t>
+        <w:t>BruSafe MD — Commands for S2 and S9</w:t>
       </w:r>
     </w:p>
     <w:p>
@@ -32,7 +32,7 @@
           <w:sz w:val="22"/>
           <w:szCs w:val="22"/>
         </w:rPr>
-        <w:t xml:space="preserve">Lanzamiento de las simulaciones en las PCs del laboratorio (GROMACS 2026.3 con CUDA, RTX 4070). S1 y S6 ya terminaron; este plan solo incluye S2 y S9.</w:t>
+        <w:t>Launching the simulations on the laboratory PCs (GROMACS 2026.3 with CUDA, RTX 4070). S1 and S6 have finished; this plan includes only S2 and S9.</w:t>
       </w:r>
     </w:p>
     <w:p>
@@ -49,7 +49,7 @@
           <w:sz w:val="30"/>
           <w:szCs w:val="30"/>
         </w:rPr>
-        <w:t xml:space="preserve">1. Plan: un slot por PC</w:t>
+        <w:t>1. Plan: one slot per PC</w:t>
       </w:r>
     </w:p>
     <w:tbl>
@@ -102,7 +102,7 @@
                 <w:sz w:val="21"/>
                 <w:szCs w:val="21"/>
               </w:rPr>
-              <w:t xml:space="preserve">Slot</w:t>
+              <w:t>Slot</w:t>
             </w:r>
           </w:p>
         </w:tc>
@@ -133,7 +133,7 @@
                 <w:sz w:val="21"/>
                 <w:szCs w:val="21"/>
               </w:rPr>
-              <w:t xml:space="preserve">Sistema</w:t>
+              <w:t>System</w:t>
             </w:r>
           </w:p>
         </w:tc>
@@ -164,7 +164,7 @@
                 <w:sz w:val="21"/>
                 <w:szCs w:val="21"/>
               </w:rPr>
-              <w:t xml:space="preserve">Réplica</w:t>
+              <w:t>Replica</w:t>
             </w:r>
           </w:p>
         </w:tc>
@@ -195,7 +195,7 @@
                 <w:sz w:val="21"/>
                 <w:szCs w:val="21"/>
               </w:rPr>
-              <w:t xml:space="preserve">Producción</w:t>
+              <w:t>Production</w:t>
             </w:r>
           </w:p>
         </w:tc>
@@ -226,7 +226,7 @@
                 <w:sz w:val="21"/>
                 <w:szCs w:val="21"/>
               </w:rPr>
-              <w:t xml:space="preserve">Duración</w:t>
+              <w:t>Duration</w:t>
             </w:r>
           </w:p>
         </w:tc>
@@ -288,7 +288,7 @@
                 <w:sz w:val="21"/>
                 <w:szCs w:val="21"/>
               </w:rPr>
-              <w:t xml:space="preserve">S2 (scCP apo)</w:t>
+              <w:t>S2 (scCP apo)</w:t>
             </w:r>
           </w:p>
         </w:tc>
@@ -318,7 +318,7 @@
                 <w:sz w:val="21"/>
                 <w:szCs w:val="21"/>
               </w:rPr>
-              <w:t xml:space="preserve">réplica 1</w:t>
+              <w:t>replica 1</w:t>
             </w:r>
           </w:p>
         </w:tc>
@@ -440,7 +440,7 @@
                 <w:sz w:val="21"/>
                 <w:szCs w:val="21"/>
               </w:rPr>
-              <w:t xml:space="preserve">S2 (scCP apo)</w:t>
+              <w:t>S2 (scCP apo)</w:t>
             </w:r>
           </w:p>
         </w:tc>
@@ -470,7 +470,7 @@
                 <w:sz w:val="21"/>
                 <w:szCs w:val="21"/>
               </w:rPr>
-              <w:t xml:space="preserve">réplica 2</w:t>
+              <w:t>replica 2</w:t>
             </w:r>
           </w:p>
         </w:tc>
@@ -592,7 +592,7 @@
                 <w:sz w:val="21"/>
                 <w:szCs w:val="21"/>
               </w:rPr>
-              <w:t xml:space="preserve">S2 (scCP apo)</w:t>
+              <w:t>S2 (scCP apo)</w:t>
             </w:r>
           </w:p>
         </w:tc>
@@ -622,7 +622,7 @@
                 <w:sz w:val="21"/>
                 <w:szCs w:val="21"/>
               </w:rPr>
-              <w:t xml:space="preserve">réplica 3</w:t>
+              <w:t>replica 3</w:t>
             </w:r>
           </w:p>
         </w:tc>
@@ -744,7 +744,7 @@
                 <w:sz w:val="21"/>
                 <w:szCs w:val="21"/>
               </w:rPr>
-              <w:t xml:space="preserve">S9 (scCP + RNA pac)</w:t>
+              <w:t>S9 (scCP + pac RNA)</w:t>
             </w:r>
           </w:p>
         </w:tc>
@@ -774,7 +774,7 @@
                 <w:sz w:val="21"/>
                 <w:szCs w:val="21"/>
               </w:rPr>
-              <w:t xml:space="preserve">réplica 1</w:t>
+              <w:t>replica 1</w:t>
             </w:r>
           </w:p>
         </w:tc>
@@ -896,7 +896,7 @@
                 <w:sz w:val="21"/>
                 <w:szCs w:val="21"/>
               </w:rPr>
-              <w:t xml:space="preserve">S9 (scCP + RNA pac)</w:t>
+              <w:t>S9 (scCP + pac RNA)</w:t>
             </w:r>
           </w:p>
         </w:tc>
@@ -926,7 +926,7 @@
                 <w:sz w:val="21"/>
                 <w:szCs w:val="21"/>
               </w:rPr>
-              <w:t xml:space="preserve">réplica 2</w:t>
+              <w:t>replica 2</w:t>
             </w:r>
           </w:p>
         </w:tc>
@@ -1048,7 +1048,7 @@
                 <w:sz w:val="21"/>
                 <w:szCs w:val="21"/>
               </w:rPr>
-              <w:t xml:space="preserve">S9 (scCP + RNA pac)</w:t>
+              <w:t>S9 (scCP + pac RNA)</w:t>
             </w:r>
           </w:p>
         </w:tc>
@@ -1078,7 +1078,7 @@
                 <w:sz w:val="21"/>
                 <w:szCs w:val="21"/>
               </w:rPr>
-              <w:t xml:space="preserve">réplica 3</w:t>
+              <w:t>replica 3</w:t>
             </w:r>
           </w:p>
         </w:tc>
@@ -1200,7 +1200,7 @@
                 <w:sz w:val="21"/>
                 <w:szCs w:val="21"/>
               </w:rPr>
-              <w:t xml:space="preserve">S9 (scCP + RNA pac)</w:t>
+              <w:t>S9 (scCP + pac RNA)</w:t>
             </w:r>
           </w:p>
         </w:tc>
@@ -1230,7 +1230,7 @@
                 <w:sz w:val="21"/>
                 <w:szCs w:val="21"/>
               </w:rPr>
-              <w:t xml:space="preserve">réplica 4</w:t>
+              <w:t>replica 4</w:t>
             </w:r>
           </w:p>
         </w:tc>
@@ -1352,7 +1352,7 @@
                 <w:sz w:val="21"/>
                 <w:szCs w:val="21"/>
               </w:rPr>
-              <w:t xml:space="preserve">S9 (scCP + RNA pac)</w:t>
+              <w:t>S9 (scCP + pac RNA)</w:t>
             </w:r>
           </w:p>
         </w:tc>
@@ -1382,7 +1382,7 @@
                 <w:sz w:val="21"/>
                 <w:szCs w:val="21"/>
               </w:rPr>
-              <w:t xml:space="preserve">réplica 5</w:t>
+              <w:t>replica 5</w:t>
             </w:r>
           </w:p>
         </w:tc>
@@ -1471,7 +1471,7 @@
           <w:sz w:val="22"/>
           <w:szCs w:val="22"/>
         </w:rPr>
-        <w:t xml:space="preserve">Anota qué PC toma cada número para no repetir trabajo. Cada slot se corre en una sola PC y cada PC corre un solo slot.</w:t>
+        <w:t>Write down which PC takes which number so that no work is repeated. Each slot runs on a single PC, and each PC runs a single slot.</w:t>
       </w:r>
     </w:p>
     <w:p>
@@ -1488,7 +1488,7 @@
           <w:sz w:val="30"/>
           <w:szCs w:val="30"/>
         </w:rPr>
-        <w:t xml:space="preserve">2. Reglas mientras corre</w:t>
+        <w:t>2. Rules while a job is running</w:t>
       </w:r>
     </w:p>
     <w:p>
@@ -1506,7 +1506,7 @@
           <w:sz w:val="22"/>
           <w:szCs w:val="22"/>
         </w:rPr>
-        <w:t xml:space="preserve">Todos los comandos van en la terminal MSYS2 UCRT64, de uno en uno, tal cual.</w:t>
+        <w:t>All commands are typed in the MSYS2 UCRT64 terminal, one at a time, exactly as written.</w:t>
       </w:r>
     </w:p>
     <w:p>
@@ -1524,7 +1524,7 @@
           <w:sz w:val="22"/>
           <w:szCs w:val="22"/>
         </w:rPr>
-        <w:t xml:space="preserve">Nunca Ctrl+C en la Terminal 1: detiene la corrida.</w:t>
+        <w:t>Never press Ctrl+C in Terminal 1: it stops the run.</w:t>
       </w:r>
     </w:p>
     <w:p>
@@ -1542,7 +1542,7 @@
           <w:sz w:val="22"/>
           <w:szCs w:val="22"/>
         </w:rPr>
-        <w:t xml:space="preserve">No cierres esa ventana. Bloquea con Win+L; no cierres sesión y evita que el equipo se suspenda.</w:t>
+        <w:t>Do not close that window. Lock the screen with Win+L; do not sign out and do not let the machine sleep.</w:t>
       </w:r>
     </w:p>
     <w:p>
@@ -1560,7 +1560,7 @@
           <w:sz w:val="22"/>
           <w:szCs w:val="22"/>
         </w:rPr>
-        <w:t xml:space="preserve">Solo una corrida por PC. Antes de lanzar, comprueba que no haya otra: tasklist | grep -i gmx</w:t>
+        <w:t>Only one run per PC. Before launching, check that none is running: tasklist | grep -i gmx</w:t>
       </w:r>
     </w:p>
     <w:p>
@@ -1578,7 +1578,7 @@
           <w:sz w:val="22"/>
           <w:szCs w:val="22"/>
         </w:rPr>
-        <w:t xml:space="preserve">Si se corta la luz o la PC se reinicia: abre UCRT64 y repite el mismo comando de lanzamiento. Retoma del último checkpoint.</w:t>
+        <w:t>After a power cut or a restart: open UCRT64 and repeat the same launch command. The run resumes from the last checkpoint.</w:t>
       </w:r>
     </w:p>
     <w:p>
@@ -1595,7 +1595,7 @@
           <w:sz w:val="30"/>
           <w:szCs w:val="30"/>
         </w:rPr>
-        <w:t xml:space="preserve">3. Terminal 1: lanzar</w:t>
+        <w:t>3. Terminal 1: launch</w:t>
       </w:r>
     </w:p>
     <w:p>
@@ -1608,7 +1608,7 @@
           <w:sz w:val="22"/>
           <w:szCs w:val="22"/>
         </w:rPr>
-        <w:t xml:space="preserve">Copia solo la línea de tu número de slot. Actualiza el repositorio y lanza; la terminal queda ocupada y en silencio hasta terminar.</w:t>
+        <w:t>Copy only the line for your slot number. It updates the repository and launches the run; the terminal stays busy and silent until the run finishes.</w:t>
       </w:r>
     </w:p>
     <w:tbl>
@@ -1657,7 +1657,7 @@
                 <w:sz w:val="20"/>
                 <w:szCs w:val="20"/>
               </w:rPr>
-              <w:t xml:space="preserve">Slot 0 — S2 (scCP apo), réplica 1</w:t>
+              <w:t>Slot 0 — S2 (scCP apo), replica 1</w:t>
             </w:r>
           </w:p>
           <w:p>
@@ -1724,7 +1724,7 @@
                 <w:sz w:val="20"/>
                 <w:szCs w:val="20"/>
               </w:rPr>
-              <w:t xml:space="preserve">Slot 1 — S2 (scCP apo), réplica 2</w:t>
+              <w:t>Slot 1 — S2 (scCP apo), replica 2</w:t>
             </w:r>
           </w:p>
           <w:p>
@@ -1791,7 +1791,7 @@
                 <w:sz w:val="20"/>
                 <w:szCs w:val="20"/>
               </w:rPr>
-              <w:t xml:space="preserve">Slot 2 — S2 (scCP apo), réplica 3</w:t>
+              <w:t>Slot 2 — S2 (scCP apo), replica 3</w:t>
             </w:r>
           </w:p>
           <w:p>
@@ -1858,7 +1858,7 @@
                 <w:sz w:val="20"/>
                 <w:szCs w:val="20"/>
               </w:rPr>
-              <w:t xml:space="preserve">Slot 3 — S9 (scCP + RNA pac), réplica 1</w:t>
+              <w:t>Slot 3 — S9 (scCP + pac RNA), replica 1</w:t>
             </w:r>
           </w:p>
           <w:p>
@@ -1925,7 +1925,7 @@
                 <w:sz w:val="20"/>
                 <w:szCs w:val="20"/>
               </w:rPr>
-              <w:t xml:space="preserve">Slot 4 — S9 (scCP + RNA pac), réplica 2</w:t>
+              <w:t>Slot 4 — S9 (scCP + pac RNA), replica 2</w:t>
             </w:r>
           </w:p>
           <w:p>
@@ -1992,7 +1992,7 @@
                 <w:sz w:val="20"/>
                 <w:szCs w:val="20"/>
               </w:rPr>
-              <w:t xml:space="preserve">Slot 5 — S9 (scCP + RNA pac), réplica 3</w:t>
+              <w:t>Slot 5 — S9 (scCP + pac RNA), replica 3</w:t>
             </w:r>
           </w:p>
           <w:p>
@@ -2059,7 +2059,7 @@
                 <w:sz w:val="20"/>
                 <w:szCs w:val="20"/>
               </w:rPr>
-              <w:t xml:space="preserve">Slot 6 — S9 (scCP + RNA pac), réplica 4</w:t>
+              <w:t>Slot 6 — S9 (scCP + pac RNA), replica 4</w:t>
             </w:r>
           </w:p>
           <w:p>
@@ -2126,7 +2126,7 @@
                 <w:sz w:val="20"/>
                 <w:szCs w:val="20"/>
               </w:rPr>
-              <w:t xml:space="preserve">Slot 7 — S9 (scCP + RNA pac), réplica 5</w:t>
+              <w:t>Slot 7 — S9 (scCP + pac RNA), replica 5</w:t>
             </w:r>
           </w:p>
           <w:p>
@@ -2161,7 +2161,7 @@
           <w:sz w:val="30"/>
           <w:szCs w:val="30"/>
         </w:rPr>
-        <w:t xml:space="preserve">4. Terminal 2: ver el progreso</w:t>
+        <w:t>4. Terminal 2: follow the progress</w:t>
       </w:r>
     </w:p>
     <w:p>
@@ -2174,7 +2174,7 @@
           <w:sz w:val="22"/>
           <w:szCs w:val="22"/>
         </w:rPr>
-        <w:t xml:space="preserve">Abre una ventana UCRT64 aparte. El mismo comando sirve en todas las PCs y se refresca solo cada 30 segundos. Salir con Ctrl+C aquí es seguro.</w:t>
+        <w:t>Open a separate UCRT64 window. The same command works on every PC and refreshes every 30 seconds. Leaving it with Ctrl+C is safe.</w:t>
       </w:r>
     </w:p>
     <w:tbl>
@@ -2223,7 +2223,7 @@
                 <w:sz w:val="20"/>
                 <w:szCs w:val="20"/>
               </w:rPr>
-              <w:t xml:space="preserve">Progreso (se refresca cada 30 s)</w:t>
+              <w:t>Progress (refreshes every 30 s)</w:t>
             </w:r>
           </w:p>
           <w:p>
@@ -2254,7 +2254,7 @@
           <w:sz w:val="22"/>
           <w:szCs w:val="22"/>
         </w:rPr>
-        <w:t xml:space="preserve">Para seguir el log de tu slot (cambia el número):</w:t>
+        <w:t>To follow the log of your slot (change the number):</w:t>
       </w:r>
     </w:p>
     <w:tbl>
@@ -2317,7 +2317,7 @@
           <w:sz w:val="25"/>
           <w:szCs w:val="25"/>
         </w:rPr>
-        <w:t xml:space="preserve">Qué vas a ver</w:t>
+        <w:t>What is shown</w:t>
       </w:r>
     </w:p>
     <w:p>
@@ -2335,7 +2335,7 @@
           <w:sz w:val="22"/>
           <w:szCs w:val="22"/>
         </w:rPr>
-        <w:t xml:space="preserve">Construcción y equilibración (≈ 10–15 min): etapa equil; el log muestra building, equilibration y gate: … PASS.</w:t>
+        <w:t>Build and equilibration (≈ 10–15 min): stage equil; the log shows building, equilibration and gate: … PASS.</w:t>
       </w:r>
     </w:p>
     <w:p>
@@ -2353,7 +2353,7 @@
           <w:sz w:val="22"/>
           <w:szCs w:val="22"/>
         </w:rPr>
-        <w:t xml:space="preserve">Producción: etapa prod, con los ns del último checkpoint y el tamaño de prod.xtc.</w:t>
+        <w:t>Production: stage prod, with the ns of the last checkpoint and the size of prod.xtc.</w:t>
       </w:r>
     </w:p>
     <w:p>
@@ -2371,7 +2371,7 @@
           <w:sz w:val="22"/>
           <w:szCs w:val="22"/>
         </w:rPr>
-        <w:t xml:space="preserve">Postproceso y empaquetado (unos minutos): post-processing y results packed.</w:t>
+        <w:t>Post-processing and packing (a few minutes): post-processing and results packed.</w:t>
       </w:r>
     </w:p>
     <w:p>
@@ -2388,7 +2388,7 @@
           <w:sz w:val="30"/>
           <w:szCs w:val="30"/>
         </w:rPr>
-        <w:t xml:space="preserve">5. Si algo falla</w:t>
+        <w:t>5. If something fails</w:t>
       </w:r>
     </w:p>
     <w:p>
@@ -2401,7 +2401,7 @@
           <w:sz w:val="22"/>
           <w:szCs w:val="22"/>
         </w:rPr>
-        <w:t xml:space="preserve">Pega esta salida (con el número de tu slot) para diagnosticar:</w:t>
+        <w:t>Send this output (with your slot number) for diagnosis:</w:t>
       </w:r>
     </w:p>
     <w:tbl>
@@ -2465,7 +2465,7 @@
           <w:sz w:val="22"/>
           <w:szCs w:val="22"/>
         </w:rPr>
-        <w:t xml:space="preserve">Causas ya vistas en esta campaña:</w:t>
+        <w:t>Causes already seen in this campaign:</w:t>
       </w:r>
     </w:p>
     <w:p>
@@ -2483,7 +2483,7 @@
           <w:sz w:val="22"/>
           <w:szCs w:val="22"/>
         </w:rPr>
-        <w:t xml:space="preserve">Received the INT signal → alguien pulsó Ctrl+C. Relanza el mismo comando.</w:t>
+        <w:t>Received the INT signal → someone pressed Ctrl+C. Relaunch the same command.</w:t>
       </w:r>
     </w:p>
     <w:p>
@@ -2501,7 +2501,7 @@
           <w:sz w:val="22"/>
           <w:szCs w:val="22"/>
         </w:rPr>
-        <w:t xml:space="preserve">Cannot rename checkpoint file → bloqueo de archivo de Windows. La versión actual reintenta sola; si no, relanza.</w:t>
+        <w:t>Cannot rename checkpoint file → a Windows file lock. The current version retries automatically; otherwise, relaunch.</w:t>
       </w:r>
     </w:p>
     <w:p>
@@ -2519,7 +2519,7 @@
           <w:sz w:val="22"/>
           <w:szCs w:val="22"/>
         </w:rPr>
-        <w:t xml:space="preserve">CUDA error / illegal memory access → casi siempre hay dos corridas en el mismo GPU.</w:t>
+        <w:t>CUDA error / illegal memory access → almost always two runs on the same GPU.</w:t>
       </w:r>
     </w:p>
     <w:p>
@@ -2537,7 +2537,7 @@
           <w:sz w:val="22"/>
           <w:szCs w:val="22"/>
         </w:rPr>
-        <w:t xml:space="preserve">equilibration gate FAILED → pasa las líneas de gate.</w:t>
+        <w:t>equilibration gate FAILED → send the gate lines.</w:t>
       </w:r>
     </w:p>
     <w:p>
@@ -2555,7 +2555,7 @@
           <w:sz w:val="22"/>
           <w:szCs w:val="22"/>
         </w:rPr>
-        <w:t xml:space="preserve">missing required command: gmx → git pull --no-rebase y relanza, o source ~/.bashrc.</w:t>
+        <w:t>missing required command: gmx → git pull --no-rebase and relaunch, or source ~/.bashrc.</w:t>
       </w:r>
     </w:p>
     <w:p>
@@ -2572,7 +2572,7 @@
           <w:sz w:val="30"/>
           <w:szCs w:val="30"/>
         </w:rPr>
-        <w:t xml:space="preserve">6. Al terminar</w:t>
+        <w:t>6. When it finishes</w:t>
       </w:r>
     </w:p>
     <w:tbl>
@@ -2621,7 +2621,7 @@
                 <w:sz w:val="20"/>
                 <w:szCs w:val="20"/>
               </w:rPr>
-              <w:t xml:space="preserve">Comprobar que el slot terminó (cambia el número)</w:t>
+              <w:t>Check that the slot has finished (change the number)</w:t>
             </w:r>
           </w:p>
           <w:p>
@@ -2652,7 +2652,7 @@
           <w:sz w:val="22"/>
           <w:szCs w:val="22"/>
         </w:rPr>
-        <w:t xml:space="preserve">Debe decir: all jobs of slot N completed. Los resultados se copian a tu OneDrive, en BruSafe-MD/&lt;nombre-de-la-PC&gt;. Espera la marca verde antes de cerrar sesión, y cierra la sesión de OneDrive y de GitHub (son computadoras compartidas).</w:t>
+        <w:t>It should say: all jobs of slot N completed. The results are copied to your OneDrive, in BruSafe-MD/&lt;name-of-the-PC&gt;. Wait for the green mark before signing out, and sign out of OneDrive and GitHub (the computers are shared).</w:t>
       </w:r>
     </w:p>
     <w:tbl>
@@ -2701,7 +2701,7 @@
                 <w:sz w:val="20"/>
                 <w:szCs w:val="20"/>
               </w:rPr>
-              <w:t xml:space="preserve">Ver lo que hay en OneDrive para esta PC</w:t>
+              <w:t>List what is in OneDrive for this PC</w:t>
             </w:r>
           </w:p>
           <w:p>
@@ -2731,7 +2731,7 @@
           <w:sz w:val="30"/>
           <w:szCs w:val="30"/>
         </w:rPr>
-        <w:t xml:space="preserve">7. Nota sobre S9</w:t>
+        <w:t>7. Note on S9</w:t>
       </w:r>
     </w:p>
     <w:p>
@@ -2744,7 +2744,7 @@
           <w:sz w:val="22"/>
           <w:szCs w:val="22"/>
         </w:rPr>
-        <w:t xml:space="preserve">El modelo injertado de S9 tiene una cadena lateral (Arg49 de la copia 2) solapada con un fosfato del RNA. La minimización de prueba en CPU la resolvió, pero en la primera réplica real revisa que la etapa equil avance. Si falla en la minimización, pega las líneas del slot_N.log.</w:t>
+        <w:t>The grafted S9 model has one side chain (Arg49 of copy 2) that overlaps an RNA phosphate. The test minimisation on CPU resolved it, but in the first real replica the equil stage should be checked for progress. If it fails during minimisation, send the lines of slot_N.log.</w:t>
       </w:r>
     </w:p>
     <w:sectPr>

</xml_diff>